<commit_message>
feat: add Product & Experience Design section (08)
New section covering industrial design, UX, HMI, and brand visual trends
in the semiconductor industry. Includes 5 verified findings:
- Cadence ChipStack AI Super Agent (agentic EDA UX)
- NVIDIA Vera Rubin (extreme codesign as industrial design)
- Siemens Digital Twin Composer (HMI → virtual twin)
- Intel 18A Core Ultra Series 3 launch
- NVIDIA + industrial software partnership

Renumbers subsequent sections (Policy 09, Landscape 10, Reading 11, Calendar 12).
Updates: data.mjs, index.html, PPT, Word, REPORT_GUIDE.md

Co-Authored-By: Claude Opus 4.6 (1M context) <noreply@anthropic.com>
</commit_message>
<xml_diff>
--- a/report-2026-W15.docx
+++ b/report-2026-W15.docx
@@ -2762,7 +2762,7 @@
           <w:sz w:val="36"/>
           <w:szCs w:val="36"/>
         </w:rPr>
-        <w:t xml:space="preserve">政策与地缘</w:t>
+        <w:t xml:space="preserve">产品与体验设计</w:t>
       </w:r>
     </w:p>
     <w:p>
@@ -2776,21 +2776,7 @@
           <w:sz w:val="14"/>
           <w:szCs w:val="14"/>
         </w:rPr>
-        <w:t xml:space="preserve">POLICY &amp; GEOPOLITICS</w:t>
-      </w:r>
-    </w:p>
-    <w:p>
-      <w:pPr>
-        <w:spacing w:after="40"/>
-      </w:pPr>
-      <w:r>
-        <w:rPr>
-          <w:rFonts w:ascii="Menlo" w:cs="Menlo" w:eastAsia="Menlo" w:hAnsi="Menlo"/>
-          <w:color w:val="666666"/>
-          <w:sz w:val="13"/>
-          <w:szCs w:val="13"/>
-        </w:rPr>
-        <w:t xml:space="preserve">U.S. CONGRESS</w:t>
+        <w:t xml:space="preserve">PRODUCT &amp; EXPERIENCE DESIGN</w:t>
       </w:r>
     </w:p>
     <w:p>
@@ -2806,7 +2792,7 @@
           <w:sz w:val="24"/>
           <w:szCs w:val="24"/>
         </w:rPr>
-        <w:t xml:space="preserve">MATCH Act：封堵 DUV 对华出口</w:t>
+        <w:t xml:space="preserve">Cadence ChipStack AI Super Agent：EDA 从菜单交互走向意图对话</w:t>
       </w:r>
     </w:p>
     <w:p>
@@ -2822,7 +2808,7 @@
           <w:sz w:val="21"/>
           <w:szCs w:val="21"/>
         </w:rPr>
-        <w:t xml:space="preserve">4 月 2 日众议院推出 MATCH Act，目标收紧 ASML DUV 光刻机对华出口，施压荷兰、日本盟友全面对齐美国管制标准。JPMorgan 估计若实施，ASML EPS 可能下降 10%。</w:t>
+        <w:t xml:space="preserve">Cadence 发布 ChipStack AI Super Agent（2 月 10 日），让工程师用自然语言描述意图，由多智能体自动生成 RTL、测试平台和验证方案。早期客户 NVIDIA、Qualcomm、Altera、Tenstorrent 反馈生产力提升 10x。这是 EDA 工具 UX 从"工具操作"到"意图对话"的历史性转向。</w:t>
       </w:r>
     </w:p>
     <w:p>
@@ -2835,20 +2821,6 @@
     </w:p>
     <w:p>
       <w:pPr>
-        <w:spacing w:after="40"/>
-      </w:pPr>
-      <w:r>
-        <w:rPr>
-          <w:rFonts w:ascii="Menlo" w:cs="Menlo" w:eastAsia="Menlo" w:hAnsi="Menlo"/>
-          <w:color w:val="666666"/>
-          <w:sz w:val="13"/>
-          <w:szCs w:val="13"/>
-        </w:rPr>
-        <w:t xml:space="preserve">U.S. TARIFF</w:t>
-      </w:r>
-    </w:p>
-    <w:p>
-      <w:pPr>
         <w:spacing w:after="80"/>
       </w:pPr>
       <w:r>
@@ -2860,7 +2832,7 @@
           <w:sz w:val="24"/>
           <w:szCs w:val="24"/>
         </w:rPr>
-        <w:t xml:space="preserve">Section 232 半导体关税生效</w:t>
+        <w:t xml:space="preserve">NVIDIA Vera Rubin：从芯片到机架的"极致协同设计"语言</w:t>
       </w:r>
     </w:p>
     <w:p>
@@ -2876,7 +2848,7 @@
           <w:sz w:val="21"/>
           <w:szCs w:val="21"/>
         </w:rPr>
-        <w:t xml:space="preserve">1 月 15 日起对特定先进芯片征收 25% 关税（涵盖 Nvidia H200、AMD MI325X 等），但豁免数据中心、研发等场景。7 月 1 日将评估是否扩大范围。</w:t>
+        <w:t xml:space="preserve">NVIDIA 在 CES 和 GTC 2026 发布 Vera Rubin 平台——6 颗芯片（Vera CPU、Rubin GPU、NVLink 6、ConnectX-9、BlueField-4、Spectrum-6）协同设计为一个统一的 AI 超级计算机机架，不再是独立芯片的简单组合。这标志着 AI 硬件发布的新视觉语言：整机架即产品。</w:t>
       </w:r>
     </w:p>
     <w:p>
@@ -2889,20 +2861,6 @@
     </w:p>
     <w:p>
       <w:pPr>
-        <w:spacing w:after="40"/>
-      </w:pPr>
-      <w:r>
-        <w:rPr>
-          <w:rFonts w:ascii="Menlo" w:cs="Menlo" w:eastAsia="Menlo" w:hAnsi="Menlo"/>
-          <w:color w:val="666666"/>
-          <w:sz w:val="13"/>
-          <w:szCs w:val="13"/>
-        </w:rPr>
-        <w:t xml:space="preserve">CHIPS ACT</w:t>
-      </w:r>
-    </w:p>
-    <w:p>
-      <w:pPr>
         <w:spacing w:after="80"/>
       </w:pPr>
       <w:r>
@@ -2914,7 +2872,7 @@
           <w:sz w:val="24"/>
           <w:szCs w:val="24"/>
         </w:rPr>
-        <w:t xml:space="preserve">CHIPS Act 税收优惠面临到期</w:t>
+        <w:t xml:space="preserve">Siemens Digital Twin Composer：HMI 从仪表盘走向可导航虚拟孪生</w:t>
       </w:r>
     </w:p>
     <w:p>
@@ -2930,7 +2888,7 @@
           <w:sz w:val="21"/>
           <w:szCs w:val="21"/>
         </w:rPr>
-        <w:t xml:space="preserve">TSMC 宣布追加 $1,000 亿美国投资。但 Section 48D 先进制造投资税收抵免将于 2026 年到期，续期前景不明。</w:t>
+        <w:t xml:space="preserve">Siemens 在 CES 2026 发布 Digital Twin Composer，基于 NVIDIA Omniverse 将 2D/3D 数字孪生数据与实时遥测统一到一个场景中。"一个模型贯穿设计、仿真、运行"的理念，把晶圆厂操作员 HMI 从平面仪表盘重塑为可导航的虚拟孪生空间。2026 年中上线 Siemens Xcelerator 市场。</w:t>
       </w:r>
     </w:p>
     <w:p>
@@ -2943,6 +2901,91 @@
     </w:p>
     <w:p>
       <w:pPr>
+        <w:spacing w:after="80"/>
+      </w:pPr>
+      <w:r>
+        <w:rPr>
+          <w:rFonts w:ascii="PingFang SC" w:cs="PingFang SC" w:eastAsia="PingFang SC" w:hAnsi="PingFang SC"/>
+          <w:b/>
+          <w:bCs/>
+          <w:color w:val="1a1a1a"/>
+          <w:sz w:val="24"/>
+          <w:szCs w:val="24"/>
+        </w:rPr>
+        <w:t xml:space="preserve">Intel 18A 首秀：Core Ultra Series 3 的工业设计宣言</w:t>
+      </w:r>
+    </w:p>
+    <w:p>
+      <w:pPr>
+        <w:spacing w:after="160"/>
+      </w:pPr>
+      <w:r>
+        <w:rPr>
+          <w:rFonts w:ascii="PingFang SC" w:cs="PingFang SC" w:eastAsia="PingFang SC" w:hAnsi="PingFang SC"/>
+          <w:b w:val="false"/>
+          <w:bCs w:val="false"/>
+          <w:color w:val="333333"/>
+          <w:sz w:val="21"/>
+          <w:szCs w:val="21"/>
+        </w:rPr>
+        <w:t xml:space="preserve">Intel 在 CES 2026 发布首款 Intel 18A 量产消费平台 Core Ultra Series 3，把"美国制造"作为工业设计语言的核心叙事，将芯片封装与品牌视觉绑定到 CEO 林本坚领导下的 Intel Foundry 复兴故事。</w:t>
+      </w:r>
+    </w:p>
+    <w:p>
+      <w:pPr>
+        <w:pBdr>
+          <w:bottom w:val="single" w:color="efefef" w:sz="1" w:space="8"/>
+        </w:pBdr>
+        <w:spacing w:after="200" w:before="200"/>
+      </w:pPr>
+    </w:p>
+    <w:p>
+      <w:pPr>
+        <w:spacing w:after="80"/>
+      </w:pPr>
+      <w:r>
+        <w:rPr>
+          <w:rFonts w:ascii="PingFang SC" w:cs="PingFang SC" w:eastAsia="PingFang SC" w:hAnsi="PingFang SC"/>
+          <w:b/>
+          <w:bCs/>
+          <w:color w:val="1a1a1a"/>
+          <w:sz w:val="24"/>
+          <w:szCs w:val="24"/>
+        </w:rPr>
+        <w:t xml:space="preserve">Agentic UX 进入半导体制造：工程师工作流的新底层</w:t>
+      </w:r>
+    </w:p>
+    <w:p>
+      <w:pPr>
+        <w:spacing w:after="160"/>
+      </w:pPr>
+      <w:r>
+        <w:rPr>
+          <w:rFonts w:ascii="PingFang SC" w:cs="PingFang SC" w:eastAsia="PingFang SC" w:hAnsi="PingFang SC"/>
+          <w:b w:val="false"/>
+          <w:bCs w:val="false"/>
+          <w:color w:val="333333"/>
+          <w:sz w:val="21"/>
+          <w:szCs w:val="21"/>
+        </w:rPr>
+        <w:t xml:space="preserve">NVIDIA 宣布与 TSMC、SK 海力士、三星、联发科等全球工业软件巨头合作，将 Agentic AI 嵌入设计、工程和制造软件。原本依赖人工操作的复杂工作流，正被长时间运行的 AI Agent 接管，半导体制造 UX 迎来新的交互底层。</w:t>
+      </w:r>
+    </w:p>
+    <w:p>
+      <w:pPr>
+        <w:pBdr>
+          <w:bottom w:val="single" w:color="efefef" w:sz="1" w:space="8"/>
+        </w:pBdr>
+        <w:spacing w:after="200" w:before="200"/>
+      </w:pPr>
+    </w:p>
+    <w:p>
+      <w:r>
+        <w:br w:type="page"/>
+      </w:r>
+    </w:p>
+    <w:p>
+      <w:pPr>
         <w:spacing w:after="40" w:before="360"/>
       </w:pPr>
       <w:r>
@@ -2955,6 +2998,214 @@
           <w:szCs w:val="14"/>
         </w:rPr>
         <w:t xml:space="preserve">09</w:t>
+      </w:r>
+    </w:p>
+    <w:p>
+      <w:pPr>
+        <w:spacing w:after="40"/>
+      </w:pPr>
+      <w:r>
+        <w:rPr>
+          <w:rFonts w:ascii="PingFang SC" w:cs="PingFang SC" w:eastAsia="PingFang SC" w:hAnsi="PingFang SC"/>
+          <w:b/>
+          <w:bCs/>
+          <w:color w:val="141414"/>
+          <w:sz w:val="36"/>
+          <w:szCs w:val="36"/>
+        </w:rPr>
+        <w:t xml:space="preserve">政策与地缘</w:t>
+      </w:r>
+    </w:p>
+    <w:p>
+      <w:pPr>
+        <w:spacing w:after="280"/>
+      </w:pPr>
+      <w:r>
+        <w:rPr>
+          <w:rFonts w:ascii="Menlo" w:cs="Menlo" w:eastAsia="Menlo" w:hAnsi="Menlo"/>
+          <w:color w:val="999999"/>
+          <w:sz w:val="14"/>
+          <w:szCs w:val="14"/>
+        </w:rPr>
+        <w:t xml:space="preserve">POLICY &amp; GEOPOLITICS</w:t>
+      </w:r>
+    </w:p>
+    <w:p>
+      <w:pPr>
+        <w:spacing w:after="40"/>
+      </w:pPr>
+      <w:r>
+        <w:rPr>
+          <w:rFonts w:ascii="Menlo" w:cs="Menlo" w:eastAsia="Menlo" w:hAnsi="Menlo"/>
+          <w:color w:val="666666"/>
+          <w:sz w:val="13"/>
+          <w:szCs w:val="13"/>
+        </w:rPr>
+        <w:t xml:space="preserve">U.S. CONGRESS</w:t>
+      </w:r>
+    </w:p>
+    <w:p>
+      <w:pPr>
+        <w:spacing w:after="80"/>
+      </w:pPr>
+      <w:r>
+        <w:rPr>
+          <w:rFonts w:ascii="PingFang SC" w:cs="PingFang SC" w:eastAsia="PingFang SC" w:hAnsi="PingFang SC"/>
+          <w:b/>
+          <w:bCs/>
+          <w:color w:val="1a1a1a"/>
+          <w:sz w:val="24"/>
+          <w:szCs w:val="24"/>
+        </w:rPr>
+        <w:t xml:space="preserve">MATCH Act：封堵 DUV 对华出口</w:t>
+      </w:r>
+    </w:p>
+    <w:p>
+      <w:pPr>
+        <w:spacing w:after="160"/>
+      </w:pPr>
+      <w:r>
+        <w:rPr>
+          <w:rFonts w:ascii="PingFang SC" w:cs="PingFang SC" w:eastAsia="PingFang SC" w:hAnsi="PingFang SC"/>
+          <w:b w:val="false"/>
+          <w:bCs w:val="false"/>
+          <w:color w:val="333333"/>
+          <w:sz w:val="21"/>
+          <w:szCs w:val="21"/>
+        </w:rPr>
+        <w:t xml:space="preserve">4 月 2 日众议院推出 MATCH Act，目标收紧 ASML DUV 光刻机对华出口，施压荷兰、日本盟友全面对齐美国管制标准。JPMorgan 估计若实施，ASML EPS 可能下降 10%。</w:t>
+      </w:r>
+    </w:p>
+    <w:p>
+      <w:pPr>
+        <w:pBdr>
+          <w:bottom w:val="single" w:color="efefef" w:sz="1" w:space="8"/>
+        </w:pBdr>
+        <w:spacing w:after="200" w:before="200"/>
+      </w:pPr>
+    </w:p>
+    <w:p>
+      <w:pPr>
+        <w:spacing w:after="40"/>
+      </w:pPr>
+      <w:r>
+        <w:rPr>
+          <w:rFonts w:ascii="Menlo" w:cs="Menlo" w:eastAsia="Menlo" w:hAnsi="Menlo"/>
+          <w:color w:val="666666"/>
+          <w:sz w:val="13"/>
+          <w:szCs w:val="13"/>
+        </w:rPr>
+        <w:t xml:space="preserve">U.S. TARIFF</w:t>
+      </w:r>
+    </w:p>
+    <w:p>
+      <w:pPr>
+        <w:spacing w:after="80"/>
+      </w:pPr>
+      <w:r>
+        <w:rPr>
+          <w:rFonts w:ascii="PingFang SC" w:cs="PingFang SC" w:eastAsia="PingFang SC" w:hAnsi="PingFang SC"/>
+          <w:b/>
+          <w:bCs/>
+          <w:color w:val="1a1a1a"/>
+          <w:sz w:val="24"/>
+          <w:szCs w:val="24"/>
+        </w:rPr>
+        <w:t xml:space="preserve">Section 232 半导体关税生效</w:t>
+      </w:r>
+    </w:p>
+    <w:p>
+      <w:pPr>
+        <w:spacing w:after="160"/>
+      </w:pPr>
+      <w:r>
+        <w:rPr>
+          <w:rFonts w:ascii="PingFang SC" w:cs="PingFang SC" w:eastAsia="PingFang SC" w:hAnsi="PingFang SC"/>
+          <w:b w:val="false"/>
+          <w:bCs w:val="false"/>
+          <w:color w:val="333333"/>
+          <w:sz w:val="21"/>
+          <w:szCs w:val="21"/>
+        </w:rPr>
+        <w:t xml:space="preserve">1 月 15 日起对特定先进芯片征收 25% 关税（涵盖 Nvidia H200、AMD MI325X 等），但豁免数据中心、研发等场景。7 月 1 日将评估是否扩大范围。</w:t>
+      </w:r>
+    </w:p>
+    <w:p>
+      <w:pPr>
+        <w:pBdr>
+          <w:bottom w:val="single" w:color="efefef" w:sz="1" w:space="8"/>
+        </w:pBdr>
+        <w:spacing w:after="200" w:before="200"/>
+      </w:pPr>
+    </w:p>
+    <w:p>
+      <w:pPr>
+        <w:spacing w:after="40"/>
+      </w:pPr>
+      <w:r>
+        <w:rPr>
+          <w:rFonts w:ascii="Menlo" w:cs="Menlo" w:eastAsia="Menlo" w:hAnsi="Menlo"/>
+          <w:color w:val="666666"/>
+          <w:sz w:val="13"/>
+          <w:szCs w:val="13"/>
+        </w:rPr>
+        <w:t xml:space="preserve">CHIPS ACT</w:t>
+      </w:r>
+    </w:p>
+    <w:p>
+      <w:pPr>
+        <w:spacing w:after="80"/>
+      </w:pPr>
+      <w:r>
+        <w:rPr>
+          <w:rFonts w:ascii="PingFang SC" w:cs="PingFang SC" w:eastAsia="PingFang SC" w:hAnsi="PingFang SC"/>
+          <w:b/>
+          <w:bCs/>
+          <w:color w:val="1a1a1a"/>
+          <w:sz w:val="24"/>
+          <w:szCs w:val="24"/>
+        </w:rPr>
+        <w:t xml:space="preserve">CHIPS Act 税收优惠面临到期</w:t>
+      </w:r>
+    </w:p>
+    <w:p>
+      <w:pPr>
+        <w:spacing w:after="160"/>
+      </w:pPr>
+      <w:r>
+        <w:rPr>
+          <w:rFonts w:ascii="PingFang SC" w:cs="PingFang SC" w:eastAsia="PingFang SC" w:hAnsi="PingFang SC"/>
+          <w:b w:val="false"/>
+          <w:bCs w:val="false"/>
+          <w:color w:val="333333"/>
+          <w:sz w:val="21"/>
+          <w:szCs w:val="21"/>
+        </w:rPr>
+        <w:t xml:space="preserve">TSMC 宣布追加 $1,000 亿美国投资。但 Section 48D 先进制造投资税收抵免将于 2026 年到期，续期前景不明。</w:t>
+      </w:r>
+    </w:p>
+    <w:p>
+      <w:pPr>
+        <w:pBdr>
+          <w:bottom w:val="single" w:color="efefef" w:sz="1" w:space="8"/>
+        </w:pBdr>
+        <w:spacing w:after="200" w:before="200"/>
+      </w:pPr>
+    </w:p>
+    <w:p>
+      <w:pPr>
+        <w:spacing w:after="40" w:before="360"/>
+      </w:pPr>
+      <w:r>
+        <w:rPr>
+          <w:rFonts w:ascii="Menlo" w:cs="Menlo" w:eastAsia="Menlo" w:hAnsi="Menlo"/>
+          <w:b/>
+          <w:bCs/>
+          <w:color w:val="c0392b"/>
+          <w:sz w:val="14"/>
+          <w:szCs w:val="14"/>
+        </w:rPr>
+        <w:t xml:space="preserve">10</w:t>
       </w:r>
     </w:p>
     <w:p>
@@ -3069,7 +3320,7 @@
           <w:sz w:val="14"/>
           <w:szCs w:val="14"/>
         </w:rPr>
-        <w:t xml:space="preserve">10</w:t>
+        <w:t xml:space="preserve">11</w:t>
       </w:r>
     </w:p>
     <w:p>
@@ -3367,7 +3618,7 @@
           <w:sz w:val="14"/>
           <w:szCs w:val="14"/>
         </w:rPr>
-        <w:t xml:space="preserve">11</w:t>
+        <w:t xml:space="preserve">12</w:t>
       </w:r>
     </w:p>
     <w:p>

</xml_diff>